<commit_message>
salARY SLIP: 2026-APR,MARCH FEB
</commit_message>
<xml_diff>
--- a/src/main/java/interview/javaonlyallversion/JAVA-Checklist-for-interview.docx
+++ b/src/main/java/interview/javaonlyallversion/JAVA-Checklist-for-interview.docx
@@ -45,10 +45,1508 @@
     <w:p>
       <w:pPr>
         <w:rPr>
-          <w:lang w:val="en-US"/>
-        </w:rPr>
-      </w:pPr>
-      <w:hyperlink r:id="rId6" w:history="1">
+          <w:rFonts w:ascii="Segoe UI Emoji" w:hAnsi="Segoe UI Emoji" w:cs="Segoe UI Emoji"/>
+          <w:b/>
+          <w:bCs/>
+          <w:sz w:val="24"/>
+          <w:szCs w:val="24"/>
+          <w:lang w:val="en-US"/>
+        </w:rPr>
+      </w:pPr>
+    </w:p>
+    <w:p>
+      <w:pPr>
+        <w:rPr>
+          <w:rFonts w:ascii="Segoe UI Emoji" w:hAnsi="Segoe UI Emoji" w:cs="Segoe UI Emoji"/>
+          <w:b/>
+          <w:bCs/>
+          <w:sz w:val="24"/>
+          <w:szCs w:val="24"/>
+          <w:lang w:val="en-US"/>
+        </w:rPr>
+      </w:pPr>
+    </w:p>
+    <w:p>
+      <w:pPr>
+        <w:rPr>
+          <w:b/>
+          <w:bCs/>
+          <w:sz w:val="24"/>
+          <w:szCs w:val="24"/>
+          <w:lang w:val="en-US"/>
+        </w:rPr>
+      </w:pPr>
+      <w:r>
+        <w:rPr>
+          <w:rFonts w:ascii="Segoe UI Emoji" w:hAnsi="Segoe UI Emoji" w:cs="Segoe UI Emoji"/>
+          <w:b/>
+          <w:bCs/>
+          <w:sz w:val="24"/>
+          <w:szCs w:val="24"/>
+          <w:lang w:val="en-US"/>
+        </w:rPr>
+        <w:t>✅</w:t>
+      </w:r>
+      <w:r>
+        <w:rPr>
+          <w:b/>
+          <w:bCs/>
+          <w:sz w:val="24"/>
+          <w:szCs w:val="24"/>
+          <w:lang w:val="en-US"/>
+        </w:rPr>
+        <w:t xml:space="preserve"> LTS (Recommended for production)</w:t>
+      </w:r>
+    </w:p>
+    <w:p>
+      <w:pPr>
+        <w:rPr>
+          <w:b/>
+          <w:bCs/>
+          <w:sz w:val="24"/>
+          <w:szCs w:val="24"/>
+          <w:lang w:val="en-US"/>
+        </w:rPr>
+      </w:pPr>
+      <w:r>
+        <w:rPr>
+          <w:b/>
+          <w:bCs/>
+          <w:sz w:val="24"/>
+          <w:szCs w:val="24"/>
+          <w:lang w:val="en-US"/>
+        </w:rPr>
+        <w:t>These versions receive long-term updates and support:</w:t>
+      </w:r>
+    </w:p>
+    <w:p>
+      <w:pPr>
+        <w:numPr>
+          <w:ilvl w:val="0"/>
+          <w:numId w:val="2"/>
+        </w:numPr>
+        <w:rPr>
+          <w:b/>
+          <w:bCs/>
+          <w:sz w:val="24"/>
+          <w:szCs w:val="24"/>
+          <w:lang w:val="en-US"/>
+        </w:rPr>
+      </w:pPr>
+      <w:r>
+        <w:rPr>
+          <w:b/>
+          <w:bCs/>
+          <w:sz w:val="24"/>
+          <w:szCs w:val="24"/>
+          <w:lang w:val="en-US"/>
+        </w:rPr>
+        <w:t>Java 8 (LTS)</w:t>
+      </w:r>
+    </w:p>
+    <w:p>
+      <w:pPr>
+        <w:numPr>
+          <w:ilvl w:val="0"/>
+          <w:numId w:val="2"/>
+        </w:numPr>
+        <w:rPr>
+          <w:b/>
+          <w:bCs/>
+          <w:sz w:val="24"/>
+          <w:szCs w:val="24"/>
+          <w:lang w:val="en-US"/>
+        </w:rPr>
+      </w:pPr>
+      <w:r>
+        <w:rPr>
+          <w:b/>
+          <w:bCs/>
+          <w:sz w:val="24"/>
+          <w:szCs w:val="24"/>
+          <w:lang w:val="en-US"/>
+        </w:rPr>
+        <w:t>Java 11 (LTS)</w:t>
+      </w:r>
+    </w:p>
+    <w:p>
+      <w:pPr>
+        <w:numPr>
+          <w:ilvl w:val="0"/>
+          <w:numId w:val="2"/>
+        </w:numPr>
+        <w:rPr>
+          <w:b/>
+          <w:bCs/>
+          <w:sz w:val="24"/>
+          <w:szCs w:val="24"/>
+          <w:lang w:val="en-US"/>
+        </w:rPr>
+      </w:pPr>
+      <w:r>
+        <w:rPr>
+          <w:b/>
+          <w:bCs/>
+          <w:sz w:val="24"/>
+          <w:szCs w:val="24"/>
+          <w:lang w:val="en-US"/>
+        </w:rPr>
+        <w:t>Java 17 (LTS)</w:t>
+      </w:r>
+    </w:p>
+    <w:p>
+      <w:pPr>
+        <w:numPr>
+          <w:ilvl w:val="0"/>
+          <w:numId w:val="2"/>
+        </w:numPr>
+        <w:rPr>
+          <w:b/>
+          <w:bCs/>
+          <w:sz w:val="24"/>
+          <w:szCs w:val="24"/>
+          <w:lang w:val="en-US"/>
+        </w:rPr>
+      </w:pPr>
+      <w:r>
+        <w:rPr>
+          <w:b/>
+          <w:bCs/>
+          <w:sz w:val="24"/>
+          <w:szCs w:val="24"/>
+          <w:lang w:val="en-US"/>
+        </w:rPr>
+        <w:t>Java 21 (LTS)</w:t>
+      </w:r>
+    </w:p>
+    <w:p>
+      <w:pPr>
+        <w:numPr>
+          <w:ilvl w:val="0"/>
+          <w:numId w:val="2"/>
+        </w:numPr>
+        <w:rPr>
+          <w:b/>
+          <w:bCs/>
+          <w:sz w:val="24"/>
+          <w:szCs w:val="24"/>
+          <w:lang w:val="en-US"/>
+        </w:rPr>
+      </w:pPr>
+      <w:r>
+        <w:rPr>
+          <w:b/>
+          <w:bCs/>
+          <w:sz w:val="24"/>
+          <w:szCs w:val="24"/>
+          <w:lang w:val="en-US"/>
+        </w:rPr>
+        <w:t>Java 25 (LTS)</w:t>
+      </w:r>
+    </w:p>
+    <w:p>
+      <w:pPr>
+        <w:rPr>
+          <w:b/>
+          <w:bCs/>
+          <w:sz w:val="24"/>
+          <w:szCs w:val="24"/>
+          <w:lang w:val="en-US"/>
+        </w:rPr>
+      </w:pPr>
+      <w:r>
+        <w:rPr>
+          <w:rFonts w:ascii="Segoe UI Emoji" w:hAnsi="Segoe UI Emoji" w:cs="Segoe UI Emoji"/>
+          <w:b/>
+          <w:bCs/>
+          <w:sz w:val="24"/>
+          <w:szCs w:val="24"/>
+          <w:lang w:val="en-US"/>
+        </w:rPr>
+        <w:t>👉</w:t>
+      </w:r>
+      <w:r>
+        <w:rPr>
+          <w:b/>
+          <w:bCs/>
+          <w:sz w:val="24"/>
+          <w:szCs w:val="24"/>
+          <w:lang w:val="en-US"/>
+        </w:rPr>
+        <w:t xml:space="preserve"> These are the safest choices for enterprise systems.</w:t>
+      </w:r>
+    </w:p>
+    <w:p>
+      <w:pPr>
+        <w:rPr>
+          <w:b/>
+          <w:bCs/>
+          <w:lang w:val="en-US"/>
+        </w:rPr>
+      </w:pPr>
+      <w:r>
+        <w:rPr>
+          <w:rFonts w:ascii="Segoe UI Emoji" w:hAnsi="Segoe UI Emoji" w:cs="Segoe UI Emoji"/>
+          <w:b/>
+          <w:bCs/>
+          <w:lang w:val="en-US"/>
+        </w:rPr>
+        <w:t>✅</w:t>
+      </w:r>
+      <w:r>
+        <w:rPr>
+          <w:b/>
+          <w:bCs/>
+          <w:lang w:val="en-US"/>
+        </w:rPr>
+        <w:t xml:space="preserve"> 1. Quick Compatibility Summary</w:t>
+      </w:r>
+    </w:p>
+    <w:tbl>
+      <w:tblPr>
+        <w:tblW w:w="0" w:type="auto"/>
+        <w:tblCellSpacing w:w="15" w:type="dxa"/>
+        <w:tblCellMar>
+          <w:top w:w="15" w:type="dxa"/>
+          <w:left w:w="15" w:type="dxa"/>
+          <w:bottom w:w="15" w:type="dxa"/>
+          <w:right w:w="15" w:type="dxa"/>
+        </w:tblCellMar>
+        <w:tblLook w:val="04A0" w:firstRow="1" w:lastRow="0" w:firstColumn="1" w:lastColumn="0" w:noHBand="0" w:noVBand="1"/>
+      </w:tblPr>
+      <w:tblGrid>
+        <w:gridCol w:w="1023"/>
+        <w:gridCol w:w="1684"/>
+        <w:gridCol w:w="1476"/>
+        <w:gridCol w:w="1226"/>
+        <w:gridCol w:w="1591"/>
+        <w:gridCol w:w="2146"/>
+      </w:tblGrid>
+      <w:tr>
+        <w:trPr>
+          <w:tblCellSpacing w:w="15" w:type="dxa"/>
+        </w:trPr>
+        <w:tc>
+          <w:tcPr>
+            <w:tcW w:w="0" w:type="auto"/>
+            <w:tcBorders>
+              <w:top w:val="single" w:sz="6" w:space="0" w:color="E6E6E6"/>
+              <w:left w:val="single" w:sz="6" w:space="0" w:color="E6E6E6"/>
+              <w:bottom w:val="single" w:sz="6" w:space="0" w:color="E6E6E6"/>
+              <w:right w:val="single" w:sz="6" w:space="0" w:color="E6E6E6"/>
+            </w:tcBorders>
+            <w:shd w:val="clear" w:color="auto" w:fill="F5F5F5"/>
+            <w:vAlign w:val="center"/>
+            <w:hideMark/>
+          </w:tcPr>
+          <w:p>
+            <w:pPr>
+              <w:rPr>
+                <w:b/>
+                <w:bCs/>
+                <w:lang w:val="en-US"/>
+              </w:rPr>
+            </w:pPr>
+            <w:r>
+              <w:rPr>
+                <w:b/>
+                <w:bCs/>
+                <w:lang w:val="en-US"/>
+              </w:rPr>
+              <w:t>Java Version</w:t>
+            </w:r>
+          </w:p>
+        </w:tc>
+        <w:tc>
+          <w:tcPr>
+            <w:tcW w:w="0" w:type="auto"/>
+            <w:tcBorders>
+              <w:top w:val="single" w:sz="6" w:space="0" w:color="E6E6E6"/>
+              <w:left w:val="single" w:sz="6" w:space="0" w:color="E6E6E6"/>
+              <w:bottom w:val="single" w:sz="6" w:space="0" w:color="E6E6E6"/>
+              <w:right w:val="single" w:sz="6" w:space="0" w:color="E6E6E6"/>
+            </w:tcBorders>
+            <w:shd w:val="clear" w:color="auto" w:fill="F5F5F5"/>
+            <w:vAlign w:val="center"/>
+            <w:hideMark/>
+          </w:tcPr>
+          <w:p>
+            <w:pPr>
+              <w:rPr>
+                <w:b/>
+                <w:bCs/>
+                <w:lang w:val="en-US"/>
+              </w:rPr>
+            </w:pPr>
+            <w:r>
+              <w:rPr>
+                <w:b/>
+                <w:bCs/>
+                <w:lang w:val="en-US"/>
+              </w:rPr>
+              <w:t>Spring Boot</w:t>
+            </w:r>
+          </w:p>
+        </w:tc>
+        <w:tc>
+          <w:tcPr>
+            <w:tcW w:w="0" w:type="auto"/>
+            <w:tcBorders>
+              <w:top w:val="single" w:sz="6" w:space="0" w:color="E6E6E6"/>
+              <w:left w:val="single" w:sz="6" w:space="0" w:color="E6E6E6"/>
+              <w:bottom w:val="single" w:sz="6" w:space="0" w:color="E6E6E6"/>
+              <w:right w:val="single" w:sz="6" w:space="0" w:color="E6E6E6"/>
+            </w:tcBorders>
+            <w:shd w:val="clear" w:color="auto" w:fill="F5F5F5"/>
+            <w:vAlign w:val="center"/>
+            <w:hideMark/>
+          </w:tcPr>
+          <w:p>
+            <w:pPr>
+              <w:rPr>
+                <w:b/>
+                <w:bCs/>
+                <w:lang w:val="en-US"/>
+              </w:rPr>
+            </w:pPr>
+            <w:r>
+              <w:rPr>
+                <w:b/>
+                <w:bCs/>
+                <w:lang w:val="en-US"/>
+              </w:rPr>
+              <w:t>Spring Framework</w:t>
+            </w:r>
+          </w:p>
+        </w:tc>
+        <w:tc>
+          <w:tcPr>
+            <w:tcW w:w="0" w:type="auto"/>
+            <w:tcBorders>
+              <w:top w:val="single" w:sz="6" w:space="0" w:color="E6E6E6"/>
+              <w:left w:val="single" w:sz="6" w:space="0" w:color="E6E6E6"/>
+              <w:bottom w:val="single" w:sz="6" w:space="0" w:color="E6E6E6"/>
+              <w:right w:val="single" w:sz="6" w:space="0" w:color="E6E6E6"/>
+            </w:tcBorders>
+            <w:shd w:val="clear" w:color="auto" w:fill="F5F5F5"/>
+            <w:vAlign w:val="center"/>
+            <w:hideMark/>
+          </w:tcPr>
+          <w:p>
+            <w:pPr>
+              <w:rPr>
+                <w:b/>
+                <w:bCs/>
+                <w:lang w:val="en-US"/>
+              </w:rPr>
+            </w:pPr>
+            <w:r>
+              <w:rPr>
+                <w:b/>
+                <w:bCs/>
+                <w:lang w:val="en-US"/>
+              </w:rPr>
+              <w:t>Tomcat</w:t>
+            </w:r>
+          </w:p>
+        </w:tc>
+        <w:tc>
+          <w:tcPr>
+            <w:tcW w:w="0" w:type="auto"/>
+            <w:tcBorders>
+              <w:top w:val="single" w:sz="6" w:space="0" w:color="E6E6E6"/>
+              <w:left w:val="single" w:sz="6" w:space="0" w:color="E6E6E6"/>
+              <w:bottom w:val="single" w:sz="6" w:space="0" w:color="E6E6E6"/>
+              <w:right w:val="single" w:sz="6" w:space="0" w:color="E6E6E6"/>
+            </w:tcBorders>
+            <w:shd w:val="clear" w:color="auto" w:fill="F5F5F5"/>
+            <w:vAlign w:val="center"/>
+            <w:hideMark/>
+          </w:tcPr>
+          <w:p>
+            <w:pPr>
+              <w:rPr>
+                <w:b/>
+                <w:bCs/>
+                <w:lang w:val="en-US"/>
+              </w:rPr>
+            </w:pPr>
+            <w:r>
+              <w:rPr>
+                <w:b/>
+                <w:bCs/>
+                <w:lang w:val="en-US"/>
+              </w:rPr>
+              <w:t>Hibernate / JPA</w:t>
+            </w:r>
+          </w:p>
+        </w:tc>
+        <w:tc>
+          <w:tcPr>
+            <w:tcW w:w="0" w:type="auto"/>
+            <w:tcBorders>
+              <w:top w:val="single" w:sz="6" w:space="0" w:color="E6E6E6"/>
+              <w:left w:val="single" w:sz="6" w:space="0" w:color="E6E6E6"/>
+              <w:bottom w:val="single" w:sz="6" w:space="0" w:color="E6E6E6"/>
+              <w:right w:val="single" w:sz="6" w:space="0" w:color="E6E6E6"/>
+            </w:tcBorders>
+            <w:shd w:val="clear" w:color="auto" w:fill="F5F5F5"/>
+            <w:vAlign w:val="center"/>
+            <w:hideMark/>
+          </w:tcPr>
+          <w:p>
+            <w:pPr>
+              <w:rPr>
+                <w:b/>
+                <w:bCs/>
+                <w:lang w:val="en-US"/>
+              </w:rPr>
+            </w:pPr>
+            <w:r>
+              <w:rPr>
+                <w:b/>
+                <w:bCs/>
+                <w:lang w:val="en-US"/>
+              </w:rPr>
+              <w:t>Recommendation</w:t>
+            </w:r>
+          </w:p>
+        </w:tc>
+      </w:tr>
+      <w:tr>
+        <w:trPr>
+          <w:tblCellSpacing w:w="15" w:type="dxa"/>
+        </w:trPr>
+        <w:tc>
+          <w:tcPr>
+            <w:tcW w:w="0" w:type="auto"/>
+            <w:tcBorders>
+              <w:top w:val="single" w:sz="6" w:space="0" w:color="E6E6E6"/>
+              <w:left w:val="single" w:sz="6" w:space="0" w:color="E6E6E6"/>
+              <w:bottom w:val="single" w:sz="6" w:space="0" w:color="E6E6E6"/>
+              <w:right w:val="single" w:sz="6" w:space="0" w:color="E6E6E6"/>
+            </w:tcBorders>
+            <w:shd w:val="clear" w:color="auto" w:fill="F5F5F5"/>
+            <w:vAlign w:val="center"/>
+            <w:hideMark/>
+          </w:tcPr>
+          <w:p>
+            <w:pPr>
+              <w:rPr>
+                <w:b/>
+                <w:bCs/>
+                <w:lang w:val="en-US"/>
+              </w:rPr>
+            </w:pPr>
+            <w:r>
+              <w:rPr>
+                <w:b/>
+                <w:bCs/>
+                <w:lang w:val="en-US"/>
+              </w:rPr>
+              <w:t>Java 8</w:t>
+            </w:r>
+          </w:p>
+        </w:tc>
+        <w:tc>
+          <w:tcPr>
+            <w:tcW w:w="0" w:type="auto"/>
+            <w:tcBorders>
+              <w:top w:val="single" w:sz="6" w:space="0" w:color="E6E6E6"/>
+              <w:left w:val="single" w:sz="6" w:space="0" w:color="E6E6E6"/>
+              <w:bottom w:val="single" w:sz="6" w:space="0" w:color="E6E6E6"/>
+              <w:right w:val="single" w:sz="6" w:space="0" w:color="E6E6E6"/>
+            </w:tcBorders>
+            <w:vAlign w:val="center"/>
+            <w:hideMark/>
+          </w:tcPr>
+          <w:p>
+            <w:pPr>
+              <w:rPr>
+                <w:lang w:val="en-US"/>
+              </w:rPr>
+            </w:pPr>
+            <w:r>
+              <w:rPr>
+                <w:rFonts w:ascii="Segoe UI Emoji" w:hAnsi="Segoe UI Emoji" w:cs="Segoe UI Emoji"/>
+                <w:lang w:val="en-US"/>
+              </w:rPr>
+              <w:t>✅</w:t>
+            </w:r>
+            <w:r>
+              <w:rPr>
+                <w:lang w:val="en-US"/>
+              </w:rPr>
+              <w:t xml:space="preserve"> Boot 1.x–2.7</w:t>
+            </w:r>
+          </w:p>
+        </w:tc>
+        <w:tc>
+          <w:tcPr>
+            <w:tcW w:w="0" w:type="auto"/>
+            <w:tcBorders>
+              <w:top w:val="single" w:sz="6" w:space="0" w:color="E6E6E6"/>
+              <w:left w:val="single" w:sz="6" w:space="0" w:color="E6E6E6"/>
+              <w:bottom w:val="single" w:sz="6" w:space="0" w:color="E6E6E6"/>
+              <w:right w:val="single" w:sz="6" w:space="0" w:color="E6E6E6"/>
+            </w:tcBorders>
+            <w:vAlign w:val="center"/>
+            <w:hideMark/>
+          </w:tcPr>
+          <w:p>
+            <w:pPr>
+              <w:rPr>
+                <w:lang w:val="en-US"/>
+              </w:rPr>
+            </w:pPr>
+            <w:r>
+              <w:rPr>
+                <w:rFonts w:ascii="Segoe UI Emoji" w:hAnsi="Segoe UI Emoji" w:cs="Segoe UI Emoji"/>
+                <w:lang w:val="en-US"/>
+              </w:rPr>
+              <w:t>✅</w:t>
+            </w:r>
+            <w:r>
+              <w:rPr>
+                <w:lang w:val="en-US"/>
+              </w:rPr>
+              <w:t xml:space="preserve"> Spring 4.x–5.x</w:t>
+            </w:r>
+          </w:p>
+        </w:tc>
+        <w:tc>
+          <w:tcPr>
+            <w:tcW w:w="0" w:type="auto"/>
+            <w:tcBorders>
+              <w:top w:val="single" w:sz="6" w:space="0" w:color="E6E6E6"/>
+              <w:left w:val="single" w:sz="6" w:space="0" w:color="E6E6E6"/>
+              <w:bottom w:val="single" w:sz="6" w:space="0" w:color="E6E6E6"/>
+              <w:right w:val="single" w:sz="6" w:space="0" w:color="E6E6E6"/>
+            </w:tcBorders>
+            <w:vAlign w:val="center"/>
+            <w:hideMark/>
+          </w:tcPr>
+          <w:p>
+            <w:pPr>
+              <w:rPr>
+                <w:lang w:val="en-US"/>
+              </w:rPr>
+            </w:pPr>
+            <w:r>
+              <w:rPr>
+                <w:rFonts w:ascii="Segoe UI Emoji" w:hAnsi="Segoe UI Emoji" w:cs="Segoe UI Emoji"/>
+                <w:lang w:val="en-US"/>
+              </w:rPr>
+              <w:t>✅</w:t>
+            </w:r>
+            <w:r>
+              <w:rPr>
+                <w:lang w:val="en-US"/>
+              </w:rPr>
+              <w:t xml:space="preserve"> Tomcat 7–9</w:t>
+            </w:r>
+          </w:p>
+        </w:tc>
+        <w:tc>
+          <w:tcPr>
+            <w:tcW w:w="0" w:type="auto"/>
+            <w:tcBorders>
+              <w:top w:val="single" w:sz="6" w:space="0" w:color="E6E6E6"/>
+              <w:left w:val="single" w:sz="6" w:space="0" w:color="E6E6E6"/>
+              <w:bottom w:val="single" w:sz="6" w:space="0" w:color="E6E6E6"/>
+              <w:right w:val="single" w:sz="6" w:space="0" w:color="E6E6E6"/>
+            </w:tcBorders>
+            <w:vAlign w:val="center"/>
+            <w:hideMark/>
+          </w:tcPr>
+          <w:p>
+            <w:pPr>
+              <w:rPr>
+                <w:lang w:val="en-US"/>
+              </w:rPr>
+            </w:pPr>
+            <w:r>
+              <w:rPr>
+                <w:rFonts w:ascii="Segoe UI Emoji" w:hAnsi="Segoe UI Emoji" w:cs="Segoe UI Emoji"/>
+                <w:lang w:val="en-US"/>
+              </w:rPr>
+              <w:t>✅</w:t>
+            </w:r>
+            <w:r>
+              <w:rPr>
+                <w:lang w:val="en-US"/>
+              </w:rPr>
+              <w:t xml:space="preserve"> Hibernate 5.x</w:t>
+            </w:r>
+          </w:p>
+        </w:tc>
+        <w:tc>
+          <w:tcPr>
+            <w:tcW w:w="0" w:type="auto"/>
+            <w:tcBorders>
+              <w:top w:val="single" w:sz="6" w:space="0" w:color="E6E6E6"/>
+              <w:left w:val="single" w:sz="6" w:space="0" w:color="E6E6E6"/>
+              <w:bottom w:val="single" w:sz="6" w:space="0" w:color="E6E6E6"/>
+              <w:right w:val="single" w:sz="6" w:space="0" w:color="E6E6E6"/>
+            </w:tcBorders>
+            <w:vAlign w:val="center"/>
+            <w:hideMark/>
+          </w:tcPr>
+          <w:p>
+            <w:pPr>
+              <w:rPr>
+                <w:lang w:val="en-US"/>
+              </w:rPr>
+            </w:pPr>
+            <w:r>
+              <w:rPr>
+                <w:rFonts w:ascii="Segoe UI Emoji" w:hAnsi="Segoe UI Emoji" w:cs="Segoe UI Emoji"/>
+                <w:lang w:val="en-US"/>
+              </w:rPr>
+              <w:t>⚠️</w:t>
+            </w:r>
+            <w:r>
+              <w:rPr>
+                <w:lang w:val="en-US"/>
+              </w:rPr>
+              <w:t xml:space="preserve"> Legacy only</w:t>
+            </w:r>
+          </w:p>
+        </w:tc>
+      </w:tr>
+      <w:tr>
+        <w:trPr>
+          <w:tblCellSpacing w:w="15" w:type="dxa"/>
+        </w:trPr>
+        <w:tc>
+          <w:tcPr>
+            <w:tcW w:w="0" w:type="auto"/>
+            <w:tcBorders>
+              <w:top w:val="single" w:sz="6" w:space="0" w:color="E6E6E6"/>
+              <w:left w:val="single" w:sz="6" w:space="0" w:color="E6E6E6"/>
+              <w:bottom w:val="single" w:sz="6" w:space="0" w:color="E6E6E6"/>
+              <w:right w:val="single" w:sz="6" w:space="0" w:color="E6E6E6"/>
+            </w:tcBorders>
+            <w:shd w:val="clear" w:color="auto" w:fill="F5F5F5"/>
+            <w:vAlign w:val="center"/>
+            <w:hideMark/>
+          </w:tcPr>
+          <w:p>
+            <w:pPr>
+              <w:rPr>
+                <w:b/>
+                <w:bCs/>
+                <w:lang w:val="en-US"/>
+              </w:rPr>
+            </w:pPr>
+            <w:r>
+              <w:rPr>
+                <w:b/>
+                <w:bCs/>
+                <w:lang w:val="en-US"/>
+              </w:rPr>
+              <w:t>Java 11</w:t>
+            </w:r>
+          </w:p>
+        </w:tc>
+        <w:tc>
+          <w:tcPr>
+            <w:tcW w:w="0" w:type="auto"/>
+            <w:tcBorders>
+              <w:top w:val="single" w:sz="6" w:space="0" w:color="E6E6E6"/>
+              <w:left w:val="single" w:sz="6" w:space="0" w:color="E6E6E6"/>
+              <w:bottom w:val="single" w:sz="6" w:space="0" w:color="E6E6E6"/>
+              <w:right w:val="single" w:sz="6" w:space="0" w:color="E6E6E6"/>
+            </w:tcBorders>
+            <w:vAlign w:val="center"/>
+            <w:hideMark/>
+          </w:tcPr>
+          <w:p>
+            <w:pPr>
+              <w:rPr>
+                <w:lang w:val="en-US"/>
+              </w:rPr>
+            </w:pPr>
+            <w:r>
+              <w:rPr>
+                <w:rFonts w:ascii="Segoe UI Emoji" w:hAnsi="Segoe UI Emoji" w:cs="Segoe UI Emoji"/>
+                <w:lang w:val="en-US"/>
+              </w:rPr>
+              <w:t>✅</w:t>
+            </w:r>
+            <w:r>
+              <w:rPr>
+                <w:lang w:val="en-US"/>
+              </w:rPr>
+              <w:t xml:space="preserve"> Boot 2.x</w:t>
+            </w:r>
+          </w:p>
+        </w:tc>
+        <w:tc>
+          <w:tcPr>
+            <w:tcW w:w="0" w:type="auto"/>
+            <w:tcBorders>
+              <w:top w:val="single" w:sz="6" w:space="0" w:color="E6E6E6"/>
+              <w:left w:val="single" w:sz="6" w:space="0" w:color="E6E6E6"/>
+              <w:bottom w:val="single" w:sz="6" w:space="0" w:color="E6E6E6"/>
+              <w:right w:val="single" w:sz="6" w:space="0" w:color="E6E6E6"/>
+            </w:tcBorders>
+            <w:vAlign w:val="center"/>
+            <w:hideMark/>
+          </w:tcPr>
+          <w:p>
+            <w:pPr>
+              <w:rPr>
+                <w:lang w:val="en-US"/>
+              </w:rPr>
+            </w:pPr>
+            <w:r>
+              <w:rPr>
+                <w:rFonts w:ascii="Segoe UI Emoji" w:hAnsi="Segoe UI Emoji" w:cs="Segoe UI Emoji"/>
+                <w:lang w:val="en-US"/>
+              </w:rPr>
+              <w:t>✅</w:t>
+            </w:r>
+            <w:r>
+              <w:rPr>
+                <w:lang w:val="en-US"/>
+              </w:rPr>
+              <w:t xml:space="preserve"> Spring 5.x</w:t>
+            </w:r>
+          </w:p>
+        </w:tc>
+        <w:tc>
+          <w:tcPr>
+            <w:tcW w:w="0" w:type="auto"/>
+            <w:tcBorders>
+              <w:top w:val="single" w:sz="6" w:space="0" w:color="E6E6E6"/>
+              <w:left w:val="single" w:sz="6" w:space="0" w:color="E6E6E6"/>
+              <w:bottom w:val="single" w:sz="6" w:space="0" w:color="E6E6E6"/>
+              <w:right w:val="single" w:sz="6" w:space="0" w:color="E6E6E6"/>
+            </w:tcBorders>
+            <w:vAlign w:val="center"/>
+            <w:hideMark/>
+          </w:tcPr>
+          <w:p>
+            <w:pPr>
+              <w:rPr>
+                <w:lang w:val="en-US"/>
+              </w:rPr>
+            </w:pPr>
+            <w:r>
+              <w:rPr>
+                <w:rFonts w:ascii="Segoe UI Emoji" w:hAnsi="Segoe UI Emoji" w:cs="Segoe UI Emoji"/>
+                <w:lang w:val="en-US"/>
+              </w:rPr>
+              <w:t>✅</w:t>
+            </w:r>
+            <w:r>
+              <w:rPr>
+                <w:lang w:val="en-US"/>
+              </w:rPr>
+              <w:t xml:space="preserve"> Tomcat 9</w:t>
+            </w:r>
+          </w:p>
+        </w:tc>
+        <w:tc>
+          <w:tcPr>
+            <w:tcW w:w="0" w:type="auto"/>
+            <w:tcBorders>
+              <w:top w:val="single" w:sz="6" w:space="0" w:color="E6E6E6"/>
+              <w:left w:val="single" w:sz="6" w:space="0" w:color="E6E6E6"/>
+              <w:bottom w:val="single" w:sz="6" w:space="0" w:color="E6E6E6"/>
+              <w:right w:val="single" w:sz="6" w:space="0" w:color="E6E6E6"/>
+            </w:tcBorders>
+            <w:vAlign w:val="center"/>
+            <w:hideMark/>
+          </w:tcPr>
+          <w:p>
+            <w:pPr>
+              <w:rPr>
+                <w:lang w:val="en-US"/>
+              </w:rPr>
+            </w:pPr>
+            <w:r>
+              <w:rPr>
+                <w:rFonts w:ascii="Segoe UI Emoji" w:hAnsi="Segoe UI Emoji" w:cs="Segoe UI Emoji"/>
+                <w:lang w:val="en-US"/>
+              </w:rPr>
+              <w:t>✅</w:t>
+            </w:r>
+            <w:r>
+              <w:rPr>
+                <w:lang w:val="en-US"/>
+              </w:rPr>
+              <w:t xml:space="preserve"> Hibernate 5.x</w:t>
+            </w:r>
+          </w:p>
+        </w:tc>
+        <w:tc>
+          <w:tcPr>
+            <w:tcW w:w="0" w:type="auto"/>
+            <w:tcBorders>
+              <w:top w:val="single" w:sz="6" w:space="0" w:color="E6E6E6"/>
+              <w:left w:val="single" w:sz="6" w:space="0" w:color="E6E6E6"/>
+              <w:bottom w:val="single" w:sz="6" w:space="0" w:color="E6E6E6"/>
+              <w:right w:val="single" w:sz="6" w:space="0" w:color="E6E6E6"/>
+            </w:tcBorders>
+            <w:vAlign w:val="center"/>
+            <w:hideMark/>
+          </w:tcPr>
+          <w:p>
+            <w:pPr>
+              <w:rPr>
+                <w:lang w:val="en-US"/>
+              </w:rPr>
+            </w:pPr>
+            <w:r>
+              <w:rPr>
+                <w:rFonts w:ascii="Segoe UI Emoji" w:hAnsi="Segoe UI Emoji" w:cs="Segoe UI Emoji"/>
+                <w:lang w:val="en-US"/>
+              </w:rPr>
+              <w:t>✅</w:t>
+            </w:r>
+            <w:r>
+              <w:rPr>
+                <w:lang w:val="en-US"/>
+              </w:rPr>
+              <w:t xml:space="preserve"> Stable legacy</w:t>
+            </w:r>
+          </w:p>
+        </w:tc>
+      </w:tr>
+      <w:tr>
+        <w:trPr>
+          <w:tblCellSpacing w:w="15" w:type="dxa"/>
+        </w:trPr>
+        <w:tc>
+          <w:tcPr>
+            <w:tcW w:w="0" w:type="auto"/>
+            <w:tcBorders>
+              <w:top w:val="single" w:sz="6" w:space="0" w:color="E6E6E6"/>
+              <w:left w:val="single" w:sz="6" w:space="0" w:color="E6E6E6"/>
+              <w:bottom w:val="single" w:sz="6" w:space="0" w:color="E6E6E6"/>
+              <w:right w:val="single" w:sz="6" w:space="0" w:color="E6E6E6"/>
+            </w:tcBorders>
+            <w:shd w:val="clear" w:color="auto" w:fill="F5F5F5"/>
+            <w:vAlign w:val="center"/>
+            <w:hideMark/>
+          </w:tcPr>
+          <w:p>
+            <w:pPr>
+              <w:rPr>
+                <w:b/>
+                <w:bCs/>
+                <w:lang w:val="en-US"/>
+              </w:rPr>
+            </w:pPr>
+            <w:r>
+              <w:rPr>
+                <w:b/>
+                <w:bCs/>
+                <w:lang w:val="en-US"/>
+              </w:rPr>
+              <w:t>Java 17</w:t>
+            </w:r>
+          </w:p>
+        </w:tc>
+        <w:tc>
+          <w:tcPr>
+            <w:tcW w:w="0" w:type="auto"/>
+            <w:tcBorders>
+              <w:top w:val="single" w:sz="6" w:space="0" w:color="E6E6E6"/>
+              <w:left w:val="single" w:sz="6" w:space="0" w:color="E6E6E6"/>
+              <w:bottom w:val="single" w:sz="6" w:space="0" w:color="E6E6E6"/>
+              <w:right w:val="single" w:sz="6" w:space="0" w:color="E6E6E6"/>
+            </w:tcBorders>
+            <w:vAlign w:val="center"/>
+            <w:hideMark/>
+          </w:tcPr>
+          <w:p>
+            <w:pPr>
+              <w:rPr>
+                <w:lang w:val="en-US"/>
+              </w:rPr>
+            </w:pPr>
+            <w:r>
+              <w:rPr>
+                <w:rFonts w:ascii="Segoe UI Emoji" w:hAnsi="Segoe UI Emoji" w:cs="Segoe UI Emoji"/>
+                <w:lang w:val="en-US"/>
+              </w:rPr>
+              <w:t>✅</w:t>
+            </w:r>
+            <w:r>
+              <w:rPr>
+                <w:lang w:val="en-US"/>
+              </w:rPr>
+              <w:t xml:space="preserve"> Boot 2.6+ / 3.x</w:t>
+            </w:r>
+          </w:p>
+        </w:tc>
+        <w:tc>
+          <w:tcPr>
+            <w:tcW w:w="0" w:type="auto"/>
+            <w:tcBorders>
+              <w:top w:val="single" w:sz="6" w:space="0" w:color="E6E6E6"/>
+              <w:left w:val="single" w:sz="6" w:space="0" w:color="E6E6E6"/>
+              <w:bottom w:val="single" w:sz="6" w:space="0" w:color="E6E6E6"/>
+              <w:right w:val="single" w:sz="6" w:space="0" w:color="E6E6E6"/>
+            </w:tcBorders>
+            <w:vAlign w:val="center"/>
+            <w:hideMark/>
+          </w:tcPr>
+          <w:p>
+            <w:pPr>
+              <w:rPr>
+                <w:lang w:val="en-US"/>
+              </w:rPr>
+            </w:pPr>
+            <w:r>
+              <w:rPr>
+                <w:rFonts w:ascii="Segoe UI Emoji" w:hAnsi="Segoe UI Emoji" w:cs="Segoe UI Emoji"/>
+                <w:lang w:val="en-US"/>
+              </w:rPr>
+              <w:t>✅</w:t>
+            </w:r>
+            <w:r>
+              <w:rPr>
+                <w:lang w:val="en-US"/>
+              </w:rPr>
+              <w:t xml:space="preserve"> Spring 5.3 / 6.x</w:t>
+            </w:r>
+          </w:p>
+        </w:tc>
+        <w:tc>
+          <w:tcPr>
+            <w:tcW w:w="0" w:type="auto"/>
+            <w:tcBorders>
+              <w:top w:val="single" w:sz="6" w:space="0" w:color="E6E6E6"/>
+              <w:left w:val="single" w:sz="6" w:space="0" w:color="E6E6E6"/>
+              <w:bottom w:val="single" w:sz="6" w:space="0" w:color="E6E6E6"/>
+              <w:right w:val="single" w:sz="6" w:space="0" w:color="E6E6E6"/>
+            </w:tcBorders>
+            <w:vAlign w:val="center"/>
+            <w:hideMark/>
+          </w:tcPr>
+          <w:p>
+            <w:pPr>
+              <w:rPr>
+                <w:lang w:val="en-US"/>
+              </w:rPr>
+            </w:pPr>
+            <w:r>
+              <w:rPr>
+                <w:rFonts w:ascii="Segoe UI Emoji" w:hAnsi="Segoe UI Emoji" w:cs="Segoe UI Emoji"/>
+                <w:lang w:val="en-US"/>
+              </w:rPr>
+              <w:t>✅</w:t>
+            </w:r>
+            <w:r>
+              <w:rPr>
+                <w:lang w:val="en-US"/>
+              </w:rPr>
+              <w:t xml:space="preserve"> Tomcat 9–10</w:t>
+            </w:r>
+          </w:p>
+        </w:tc>
+        <w:tc>
+          <w:tcPr>
+            <w:tcW w:w="0" w:type="auto"/>
+            <w:tcBorders>
+              <w:top w:val="single" w:sz="6" w:space="0" w:color="E6E6E6"/>
+              <w:left w:val="single" w:sz="6" w:space="0" w:color="E6E6E6"/>
+              <w:bottom w:val="single" w:sz="6" w:space="0" w:color="E6E6E6"/>
+              <w:right w:val="single" w:sz="6" w:space="0" w:color="E6E6E6"/>
+            </w:tcBorders>
+            <w:vAlign w:val="center"/>
+            <w:hideMark/>
+          </w:tcPr>
+          <w:p>
+            <w:pPr>
+              <w:rPr>
+                <w:lang w:val="en-US"/>
+              </w:rPr>
+            </w:pPr>
+            <w:r>
+              <w:rPr>
+                <w:rFonts w:ascii="Segoe UI Emoji" w:hAnsi="Segoe UI Emoji" w:cs="Segoe UI Emoji"/>
+                <w:lang w:val="en-US"/>
+              </w:rPr>
+              <w:t>✅</w:t>
+            </w:r>
+            <w:r>
+              <w:rPr>
+                <w:lang w:val="en-US"/>
+              </w:rPr>
+              <w:t xml:space="preserve"> Hibernate 5.6 / 6.x</w:t>
+            </w:r>
+          </w:p>
+        </w:tc>
+        <w:tc>
+          <w:tcPr>
+            <w:tcW w:w="0" w:type="auto"/>
+            <w:tcBorders>
+              <w:top w:val="single" w:sz="6" w:space="0" w:color="E6E6E6"/>
+              <w:left w:val="single" w:sz="6" w:space="0" w:color="E6E6E6"/>
+              <w:bottom w:val="single" w:sz="6" w:space="0" w:color="E6E6E6"/>
+              <w:right w:val="single" w:sz="6" w:space="0" w:color="E6E6E6"/>
+            </w:tcBorders>
+            <w:vAlign w:val="center"/>
+            <w:hideMark/>
+          </w:tcPr>
+          <w:p>
+            <w:pPr>
+              <w:rPr>
+                <w:lang w:val="en-US"/>
+              </w:rPr>
+            </w:pPr>
+            <w:r>
+              <w:rPr>
+                <w:rFonts w:ascii="Segoe UI Emoji" w:hAnsi="Segoe UI Emoji" w:cs="Segoe UI Emoji"/>
+                <w:lang w:val="en-US"/>
+              </w:rPr>
+              <w:t>✅</w:t>
+            </w:r>
+            <w:r>
+              <w:rPr>
+                <w:lang w:val="en-US"/>
+              </w:rPr>
+              <w:t xml:space="preserve"> Most used today</w:t>
+            </w:r>
+          </w:p>
+        </w:tc>
+      </w:tr>
+      <w:tr>
+        <w:trPr>
+          <w:tblCellSpacing w:w="15" w:type="dxa"/>
+        </w:trPr>
+        <w:tc>
+          <w:tcPr>
+            <w:tcW w:w="0" w:type="auto"/>
+            <w:tcBorders>
+              <w:top w:val="single" w:sz="6" w:space="0" w:color="E6E6E6"/>
+              <w:left w:val="single" w:sz="6" w:space="0" w:color="E6E6E6"/>
+              <w:bottom w:val="single" w:sz="6" w:space="0" w:color="E6E6E6"/>
+              <w:right w:val="single" w:sz="6" w:space="0" w:color="E6E6E6"/>
+            </w:tcBorders>
+            <w:shd w:val="clear" w:color="auto" w:fill="F5F5F5"/>
+            <w:vAlign w:val="center"/>
+            <w:hideMark/>
+          </w:tcPr>
+          <w:p>
+            <w:pPr>
+              <w:rPr>
+                <w:b/>
+                <w:bCs/>
+                <w:lang w:val="en-US"/>
+              </w:rPr>
+            </w:pPr>
+            <w:r>
+              <w:rPr>
+                <w:b/>
+                <w:bCs/>
+                <w:lang w:val="en-US"/>
+              </w:rPr>
+              <w:t>Java 21</w:t>
+            </w:r>
+          </w:p>
+        </w:tc>
+        <w:tc>
+          <w:tcPr>
+            <w:tcW w:w="0" w:type="auto"/>
+            <w:tcBorders>
+              <w:top w:val="single" w:sz="6" w:space="0" w:color="E6E6E6"/>
+              <w:left w:val="single" w:sz="6" w:space="0" w:color="E6E6E6"/>
+              <w:bottom w:val="single" w:sz="6" w:space="0" w:color="E6E6E6"/>
+              <w:right w:val="single" w:sz="6" w:space="0" w:color="E6E6E6"/>
+            </w:tcBorders>
+            <w:vAlign w:val="center"/>
+            <w:hideMark/>
+          </w:tcPr>
+          <w:p>
+            <w:pPr>
+              <w:rPr>
+                <w:lang w:val="en-US"/>
+              </w:rPr>
+            </w:pPr>
+            <w:r>
+              <w:rPr>
+                <w:rFonts w:ascii="Segoe UI Emoji" w:hAnsi="Segoe UI Emoji" w:cs="Segoe UI Emoji"/>
+                <w:lang w:val="en-US"/>
+              </w:rPr>
+              <w:t>✅</w:t>
+            </w:r>
+            <w:r>
+              <w:rPr>
+                <w:lang w:val="en-US"/>
+              </w:rPr>
+              <w:t xml:space="preserve"> Boot 3.x</w:t>
+            </w:r>
+          </w:p>
+        </w:tc>
+        <w:tc>
+          <w:tcPr>
+            <w:tcW w:w="0" w:type="auto"/>
+            <w:tcBorders>
+              <w:top w:val="single" w:sz="6" w:space="0" w:color="E6E6E6"/>
+              <w:left w:val="single" w:sz="6" w:space="0" w:color="E6E6E6"/>
+              <w:bottom w:val="single" w:sz="6" w:space="0" w:color="E6E6E6"/>
+              <w:right w:val="single" w:sz="6" w:space="0" w:color="E6E6E6"/>
+            </w:tcBorders>
+            <w:vAlign w:val="center"/>
+            <w:hideMark/>
+          </w:tcPr>
+          <w:p>
+            <w:pPr>
+              <w:rPr>
+                <w:lang w:val="en-US"/>
+              </w:rPr>
+            </w:pPr>
+            <w:r>
+              <w:rPr>
+                <w:rFonts w:ascii="Segoe UI Emoji" w:hAnsi="Segoe UI Emoji" w:cs="Segoe UI Emoji"/>
+                <w:lang w:val="en-US"/>
+              </w:rPr>
+              <w:t>✅</w:t>
+            </w:r>
+            <w:r>
+              <w:rPr>
+                <w:lang w:val="en-US"/>
+              </w:rPr>
+              <w:t xml:space="preserve"> Spring 6.x</w:t>
+            </w:r>
+          </w:p>
+        </w:tc>
+        <w:tc>
+          <w:tcPr>
+            <w:tcW w:w="0" w:type="auto"/>
+            <w:tcBorders>
+              <w:top w:val="single" w:sz="6" w:space="0" w:color="E6E6E6"/>
+              <w:left w:val="single" w:sz="6" w:space="0" w:color="E6E6E6"/>
+              <w:bottom w:val="single" w:sz="6" w:space="0" w:color="E6E6E6"/>
+              <w:right w:val="single" w:sz="6" w:space="0" w:color="E6E6E6"/>
+            </w:tcBorders>
+            <w:vAlign w:val="center"/>
+            <w:hideMark/>
+          </w:tcPr>
+          <w:p>
+            <w:pPr>
+              <w:rPr>
+                <w:lang w:val="en-US"/>
+              </w:rPr>
+            </w:pPr>
+            <w:r>
+              <w:rPr>
+                <w:rFonts w:ascii="Segoe UI Emoji" w:hAnsi="Segoe UI Emoji" w:cs="Segoe UI Emoji"/>
+                <w:lang w:val="en-US"/>
+              </w:rPr>
+              <w:t>✅</w:t>
+            </w:r>
+            <w:r>
+              <w:rPr>
+                <w:lang w:val="en-US"/>
+              </w:rPr>
+              <w:t xml:space="preserve"> Tomcat 10.1+</w:t>
+            </w:r>
+          </w:p>
+        </w:tc>
+        <w:tc>
+          <w:tcPr>
+            <w:tcW w:w="0" w:type="auto"/>
+            <w:tcBorders>
+              <w:top w:val="single" w:sz="6" w:space="0" w:color="E6E6E6"/>
+              <w:left w:val="single" w:sz="6" w:space="0" w:color="E6E6E6"/>
+              <w:bottom w:val="single" w:sz="6" w:space="0" w:color="E6E6E6"/>
+              <w:right w:val="single" w:sz="6" w:space="0" w:color="E6E6E6"/>
+            </w:tcBorders>
+            <w:vAlign w:val="center"/>
+            <w:hideMark/>
+          </w:tcPr>
+          <w:p>
+            <w:pPr>
+              <w:rPr>
+                <w:lang w:val="en-US"/>
+              </w:rPr>
+            </w:pPr>
+            <w:r>
+              <w:rPr>
+                <w:rFonts w:ascii="Segoe UI Emoji" w:hAnsi="Segoe UI Emoji" w:cs="Segoe UI Emoji"/>
+                <w:lang w:val="en-US"/>
+              </w:rPr>
+              <w:t>✅</w:t>
+            </w:r>
+            <w:r>
+              <w:rPr>
+                <w:lang w:val="en-US"/>
+              </w:rPr>
+              <w:t xml:space="preserve"> Hibernate 6.x</w:t>
+            </w:r>
+          </w:p>
+        </w:tc>
+        <w:tc>
+          <w:tcPr>
+            <w:tcW w:w="0" w:type="auto"/>
+            <w:tcBorders>
+              <w:top w:val="single" w:sz="6" w:space="0" w:color="E6E6E6"/>
+              <w:left w:val="single" w:sz="6" w:space="0" w:color="E6E6E6"/>
+              <w:bottom w:val="single" w:sz="6" w:space="0" w:color="E6E6E6"/>
+              <w:right w:val="single" w:sz="6" w:space="0" w:color="E6E6E6"/>
+            </w:tcBorders>
+            <w:vAlign w:val="center"/>
+            <w:hideMark/>
+          </w:tcPr>
+          <w:p>
+            <w:pPr>
+              <w:rPr>
+                <w:lang w:val="en-US"/>
+              </w:rPr>
+            </w:pPr>
+            <w:r>
+              <w:rPr>
+                <w:rFonts w:ascii="Segoe UI Emoji" w:hAnsi="Segoe UI Emoji" w:cs="Segoe UI Emoji"/>
+                <w:lang w:val="en-US"/>
+              </w:rPr>
+              <w:t>✅</w:t>
+            </w:r>
+            <w:r>
+              <w:rPr>
+                <w:lang w:val="en-US"/>
+              </w:rPr>
+              <w:t xml:space="preserve"> Recommended current</w:t>
+            </w:r>
+          </w:p>
+        </w:tc>
+      </w:tr>
+      <w:tr>
+        <w:trPr>
+          <w:tblCellSpacing w:w="15" w:type="dxa"/>
+        </w:trPr>
+        <w:tc>
+          <w:tcPr>
+            <w:tcW w:w="0" w:type="auto"/>
+            <w:tcBorders>
+              <w:top w:val="single" w:sz="6" w:space="0" w:color="E6E6E6"/>
+              <w:left w:val="single" w:sz="6" w:space="0" w:color="E6E6E6"/>
+              <w:bottom w:val="single" w:sz="6" w:space="0" w:color="E6E6E6"/>
+              <w:right w:val="single" w:sz="6" w:space="0" w:color="E6E6E6"/>
+            </w:tcBorders>
+            <w:shd w:val="clear" w:color="auto" w:fill="F5F5F5"/>
+            <w:vAlign w:val="center"/>
+            <w:hideMark/>
+          </w:tcPr>
+          <w:p>
+            <w:pPr>
+              <w:rPr>
+                <w:b/>
+                <w:bCs/>
+                <w:lang w:val="en-US"/>
+              </w:rPr>
+            </w:pPr>
+            <w:r>
+              <w:rPr>
+                <w:b/>
+                <w:bCs/>
+                <w:lang w:val="en-US"/>
+              </w:rPr>
+              <w:t>Java 25</w:t>
+            </w:r>
+          </w:p>
+        </w:tc>
+        <w:tc>
+          <w:tcPr>
+            <w:tcW w:w="0" w:type="auto"/>
+            <w:tcBorders>
+              <w:top w:val="single" w:sz="6" w:space="0" w:color="E6E6E6"/>
+              <w:left w:val="single" w:sz="6" w:space="0" w:color="E6E6E6"/>
+              <w:bottom w:val="single" w:sz="6" w:space="0" w:color="E6E6E6"/>
+              <w:right w:val="single" w:sz="6" w:space="0" w:color="E6E6E6"/>
+            </w:tcBorders>
+            <w:vAlign w:val="center"/>
+            <w:hideMark/>
+          </w:tcPr>
+          <w:p>
+            <w:pPr>
+              <w:rPr>
+                <w:lang w:val="en-US"/>
+              </w:rPr>
+            </w:pPr>
+            <w:r>
+              <w:rPr>
+                <w:rFonts w:ascii="Segoe UI Emoji" w:hAnsi="Segoe UI Emoji" w:cs="Segoe UI Emoji"/>
+                <w:lang w:val="en-US"/>
+              </w:rPr>
+              <w:t>✅</w:t>
+            </w:r>
+            <w:r>
+              <w:rPr>
+                <w:lang w:val="en-US"/>
+              </w:rPr>
+              <w:t xml:space="preserve"> Boot 3.x+ (latest builds)</w:t>
+            </w:r>
+          </w:p>
+        </w:tc>
+        <w:tc>
+          <w:tcPr>
+            <w:tcW w:w="0" w:type="auto"/>
+            <w:tcBorders>
+              <w:top w:val="single" w:sz="6" w:space="0" w:color="E6E6E6"/>
+              <w:left w:val="single" w:sz="6" w:space="0" w:color="E6E6E6"/>
+              <w:bottom w:val="single" w:sz="6" w:space="0" w:color="E6E6E6"/>
+              <w:right w:val="single" w:sz="6" w:space="0" w:color="E6E6E6"/>
+            </w:tcBorders>
+            <w:vAlign w:val="center"/>
+            <w:hideMark/>
+          </w:tcPr>
+          <w:p>
+            <w:pPr>
+              <w:rPr>
+                <w:lang w:val="en-US"/>
+              </w:rPr>
+            </w:pPr>
+            <w:r>
+              <w:rPr>
+                <w:rFonts w:ascii="Segoe UI Emoji" w:hAnsi="Segoe UI Emoji" w:cs="Segoe UI Emoji"/>
+                <w:lang w:val="en-US"/>
+              </w:rPr>
+              <w:t>✅</w:t>
+            </w:r>
+            <w:r>
+              <w:rPr>
+                <w:lang w:val="en-US"/>
+              </w:rPr>
+              <w:t xml:space="preserve"> Spring 6.x+</w:t>
+            </w:r>
+          </w:p>
+        </w:tc>
+        <w:tc>
+          <w:tcPr>
+            <w:tcW w:w="0" w:type="auto"/>
+            <w:tcBorders>
+              <w:top w:val="single" w:sz="6" w:space="0" w:color="E6E6E6"/>
+              <w:left w:val="single" w:sz="6" w:space="0" w:color="E6E6E6"/>
+              <w:bottom w:val="single" w:sz="6" w:space="0" w:color="E6E6E6"/>
+              <w:right w:val="single" w:sz="6" w:space="0" w:color="E6E6E6"/>
+            </w:tcBorders>
+            <w:vAlign w:val="center"/>
+            <w:hideMark/>
+          </w:tcPr>
+          <w:p>
+            <w:pPr>
+              <w:rPr>
+                <w:lang w:val="en-US"/>
+              </w:rPr>
+            </w:pPr>
+            <w:r>
+              <w:rPr>
+                <w:rFonts w:ascii="Segoe UI Emoji" w:hAnsi="Segoe UI Emoji" w:cs="Segoe UI Emoji"/>
+                <w:lang w:val="en-US"/>
+              </w:rPr>
+              <w:t>✅</w:t>
+            </w:r>
+            <w:r>
+              <w:rPr>
+                <w:lang w:val="en-US"/>
+              </w:rPr>
+              <w:t xml:space="preserve"> Tomcat 10.1+</w:t>
+            </w:r>
+          </w:p>
+        </w:tc>
+        <w:tc>
+          <w:tcPr>
+            <w:tcW w:w="0" w:type="auto"/>
+            <w:tcBorders>
+              <w:top w:val="single" w:sz="6" w:space="0" w:color="E6E6E6"/>
+              <w:left w:val="single" w:sz="6" w:space="0" w:color="E6E6E6"/>
+              <w:bottom w:val="single" w:sz="6" w:space="0" w:color="E6E6E6"/>
+              <w:right w:val="single" w:sz="6" w:space="0" w:color="E6E6E6"/>
+            </w:tcBorders>
+            <w:vAlign w:val="center"/>
+            <w:hideMark/>
+          </w:tcPr>
+          <w:p>
+            <w:pPr>
+              <w:rPr>
+                <w:lang w:val="en-US"/>
+              </w:rPr>
+            </w:pPr>
+            <w:r>
+              <w:rPr>
+                <w:rFonts w:ascii="Segoe UI Emoji" w:hAnsi="Segoe UI Emoji" w:cs="Segoe UI Emoji"/>
+                <w:lang w:val="en-US"/>
+              </w:rPr>
+              <w:t>✅</w:t>
+            </w:r>
+            <w:r>
+              <w:rPr>
+                <w:lang w:val="en-US"/>
+              </w:rPr>
+              <w:t xml:space="preserve"> Hibernate 6.x</w:t>
+            </w:r>
+          </w:p>
+        </w:tc>
+        <w:tc>
+          <w:tcPr>
+            <w:tcW w:w="0" w:type="auto"/>
+            <w:tcBorders>
+              <w:top w:val="single" w:sz="6" w:space="0" w:color="E6E6E6"/>
+              <w:left w:val="single" w:sz="6" w:space="0" w:color="E6E6E6"/>
+              <w:bottom w:val="single" w:sz="6" w:space="0" w:color="E6E6E6"/>
+              <w:right w:val="single" w:sz="6" w:space="0" w:color="E6E6E6"/>
+            </w:tcBorders>
+            <w:vAlign w:val="center"/>
+            <w:hideMark/>
+          </w:tcPr>
+          <w:p>
+            <w:pPr>
+              <w:rPr>
+                <w:lang w:val="en-US"/>
+              </w:rPr>
+            </w:pPr>
+            <w:r>
+              <w:rPr>
+                <w:rFonts w:ascii="Segoe UI Emoji" w:hAnsi="Segoe UI Emoji" w:cs="Segoe UI Emoji"/>
+                <w:lang w:val="en-US"/>
+              </w:rPr>
+              <w:t>⚠️</w:t>
+            </w:r>
+            <w:r>
+              <w:rPr>
+                <w:lang w:val="en-US"/>
+              </w:rPr>
+              <w:t xml:space="preserve"> New LTS / growing</w:t>
+            </w:r>
+          </w:p>
+        </w:tc>
+      </w:tr>
+    </w:tbl>
+    <w:p>
+      <w:pPr>
+        <w:rPr>
+          <w:lang w:val="en-US"/>
+        </w:rPr>
+      </w:pPr>
+    </w:p>
+    <w:p>
+      <w:pPr>
+        <w:rPr>
+          <w:lang w:val="en-US"/>
+        </w:rPr>
+      </w:pPr>
+    </w:p>
+    <w:p>
+      <w:pPr>
+        <w:rPr>
+          <w:lang w:val="en-US"/>
+        </w:rPr>
+      </w:pPr>
+    </w:p>
+    <w:p>
+      <w:pPr>
+        <w:rPr>
+          <w:lang w:val="en-US"/>
+        </w:rPr>
+      </w:pPr>
+      <w:hyperlink r:id="rId7" w:history="1">
         <w:proofErr w:type="spellStart"/>
         <w:r>
           <w:rPr>
@@ -120,7 +1618,7 @@
           <w:lang w:val="en-US"/>
         </w:rPr>
       </w:pPr>
-      <w:hyperlink r:id="rId7" w:history="1">
+      <w:hyperlink r:id="rId8" w:history="1">
         <w:r>
           <w:rPr>
             <w:rStyle w:val="Hyperlink"/>
@@ -142,7 +1640,7 @@
           <w:lang w:val="en-US"/>
         </w:rPr>
       </w:pPr>
-      <w:hyperlink r:id="rId8" w:history="1">
+      <w:hyperlink r:id="rId9" w:history="1">
         <w:r>
           <w:rPr>
             <w:rStyle w:val="Hyperlink"/>
@@ -187,7 +1685,7 @@
       </w:pPr>
     </w:p>
     <w:p>
-      <w:hyperlink r:id="rId9" w:history="1">
+      <w:hyperlink r:id="rId10" w:history="1">
         <w:r>
           <w:rPr>
             <w:rStyle w:val="Hyperlink"/>
@@ -217,7 +1715,7 @@
           <w:lang w:val="en-US"/>
         </w:rPr>
       </w:pPr>
-      <w:hyperlink r:id="rId10" w:history="1">
+      <w:hyperlink r:id="rId11" w:history="1">
         <w:r>
           <w:rPr>
             <w:rStyle w:val="Hyperlink"/>
@@ -246,7 +1744,7 @@
           <w:lang w:val="en-US"/>
         </w:rPr>
       </w:pPr>
-      <w:hyperlink r:id="rId11" w:history="1">
+      <w:hyperlink r:id="rId12" w:history="1">
         <w:r>
           <w:rPr>
             <w:rStyle w:val="Hyperlink"/>
@@ -275,7 +1773,7 @@
           <w:lang w:val="en-US"/>
         </w:rPr>
       </w:pPr>
-      <w:hyperlink r:id="rId12" w:history="1">
+      <w:hyperlink r:id="rId13" w:history="1">
         <w:r>
           <w:rPr>
             <w:rStyle w:val="Hyperlink"/>
@@ -314,12 +1812,12 @@
       </w:pPr>
     </w:p>
     <w:sectPr>
-      <w:headerReference w:type="even" r:id="rId13"/>
-      <w:headerReference w:type="default" r:id="rId14"/>
-      <w:footerReference w:type="even" r:id="rId15"/>
-      <w:footerReference w:type="default" r:id="rId16"/>
-      <w:headerReference w:type="first" r:id="rId17"/>
-      <w:footerReference w:type="first" r:id="rId18"/>
+      <w:headerReference w:type="even" r:id="rId14"/>
+      <w:headerReference w:type="default" r:id="rId15"/>
+      <w:footerReference w:type="even" r:id="rId16"/>
+      <w:footerReference w:type="default" r:id="rId17"/>
+      <w:headerReference w:type="first" r:id="rId18"/>
+      <w:footerReference w:type="first" r:id="rId19"/>
       <w:pgSz w:w="11906" w:h="16838"/>
       <w:pgMar w:top="1440" w:right="1440" w:bottom="1440" w:left="1440" w:header="708" w:footer="708" w:gutter="0"/>
       <w:pgBorders w:offsetFrom="page">
@@ -490,6 +1988,407 @@
     </w:pPr>
   </w:p>
 </w:hdr>
+</file>
+
+<file path=word/numbering.xml><?xml version="1.0" encoding="utf-8"?>
+<w:numbering xmlns:wpc="http://schemas.microsoft.com/office/word/2010/wordprocessingCanvas" xmlns:cx="http://schemas.microsoft.com/office/drawing/2014/chartex" xmlns:cx1="http://schemas.microsoft.com/office/drawing/2015/9/8/chartex" xmlns:cx2="http://schemas.microsoft.com/office/drawing/2015/10/21/chartex" xmlns:cx3="http://schemas.microsoft.com/office/drawing/2016/5/9/chartex" xmlns:cx4="http://schemas.microsoft.com/office/drawing/2016/5/10/chartex" xmlns:cx5="http://schemas.microsoft.com/office/drawing/2016/5/11/chartex" xmlns:cx6="http://schemas.microsoft.com/office/drawing/2016/5/12/chartex" xmlns:cx7="http://schemas.microsoft.com/office/drawing/2016/5/13/chartex" xmlns:cx8="http://schemas.microsoft.com/office/drawing/2016/5/14/chartex" xmlns:mc="http://schemas.openxmlformats.org/markup-compatibility/2006" xmlns:aink="http://schemas.microsoft.com/office/drawing/2016/ink" xmlns:am3d="http://schemas.microsoft.com/office/drawing/2017/model3d" xmlns:o="urn:schemas-microsoft-com:office:office" xmlns:oel="http://schemas.microsoft.com/office/2019/extlst" xmlns:r="http://schemas.openxmlformats.org/officeDocument/2006/relationships" xmlns:m="http://schemas.openxmlformats.org/officeDocument/2006/math" xmlns:v="urn:schemas-microsoft-com:vml" xmlns:wp14="http://schemas.microsoft.com/office/word/2010/wordprocessingDrawing" xmlns:wp="http://schemas.openxmlformats.org/drawingml/2006/wordprocessingDrawing" xmlns:w10="urn:schemas-microsoft-com:office:word" xmlns:w="http://schemas.openxmlformats.org/wordprocessingml/2006/main" xmlns:w14="http://schemas.microsoft.com/office/word/2010/wordml" xmlns:w15="http://schemas.microsoft.com/office/word/2012/wordml" xmlns:w16cex="http://schemas.microsoft.com/office/word/2018/wordml/cex" xmlns:w16cid="http://schemas.microsoft.com/office/word/2016/wordml/cid" xmlns:w16="http://schemas.microsoft.com/office/word/2018/wordml" xmlns:w16du="http://schemas.microsoft.com/office/word/2023/wordml/word16du" xmlns:w16sdtdh="http://schemas.microsoft.com/office/word/2020/wordml/sdtdatahash" xmlns:w16sdtfl="http://schemas.microsoft.com/office/word/2024/wordml/sdtformatlock" xmlns:w16se="http://schemas.microsoft.com/office/word/2015/wordml/symex" xmlns:wpg="http://schemas.microsoft.com/office/word/2010/wordprocessingGroup" xmlns:wpi="http://schemas.microsoft.com/office/word/2010/wordprocessingInk" xmlns:wne="http://schemas.microsoft.com/office/word/2006/wordml" xmlns:wps="http://schemas.microsoft.com/office/word/2010/wordprocessingShape" mc:Ignorable="w14 w15 w16se w16cid w16 w16cex w16sdtdh w16sdtfl w16du wp14">
+  <w:abstractNum w:abstractNumId="0" w15:restartNumberingAfterBreak="0">
+    <w:nsid w:val="152326AD"/>
+    <w:multiLevelType w:val="multilevel"/>
+    <w:tmpl w:val="0ABE8F8A"/>
+    <w:lvl w:ilvl="0">
+      <w:start w:val="1"/>
+      <w:numFmt w:val="bullet"/>
+      <w:lvlText w:val=""/>
+      <w:lvlJc w:val="left"/>
+      <w:pPr>
+        <w:tabs>
+          <w:tab w:val="num" w:pos="720"/>
+        </w:tabs>
+        <w:ind w:left="720" w:hanging="360"/>
+      </w:pPr>
+      <w:rPr>
+        <w:rFonts w:ascii="Symbol" w:hAnsi="Symbol" w:hint="default"/>
+        <w:sz w:val="20"/>
+      </w:rPr>
+    </w:lvl>
+    <w:lvl w:ilvl="1" w:tentative="1">
+      <w:start w:val="1"/>
+      <w:numFmt w:val="bullet"/>
+      <w:lvlText w:val="o"/>
+      <w:lvlJc w:val="left"/>
+      <w:pPr>
+        <w:tabs>
+          <w:tab w:val="num" w:pos="1440"/>
+        </w:tabs>
+        <w:ind w:left="1440" w:hanging="360"/>
+      </w:pPr>
+      <w:rPr>
+        <w:rFonts w:ascii="Courier New" w:hAnsi="Courier New" w:hint="default"/>
+        <w:sz w:val="20"/>
+      </w:rPr>
+    </w:lvl>
+    <w:lvl w:ilvl="2" w:tentative="1">
+      <w:start w:val="1"/>
+      <w:numFmt w:val="bullet"/>
+      <w:lvlText w:val=""/>
+      <w:lvlJc w:val="left"/>
+      <w:pPr>
+        <w:tabs>
+          <w:tab w:val="num" w:pos="2160"/>
+        </w:tabs>
+        <w:ind w:left="2160" w:hanging="360"/>
+      </w:pPr>
+      <w:rPr>
+        <w:rFonts w:ascii="Wingdings" w:hAnsi="Wingdings" w:hint="default"/>
+        <w:sz w:val="20"/>
+      </w:rPr>
+    </w:lvl>
+    <w:lvl w:ilvl="3" w:tentative="1">
+      <w:start w:val="1"/>
+      <w:numFmt w:val="bullet"/>
+      <w:lvlText w:val=""/>
+      <w:lvlJc w:val="left"/>
+      <w:pPr>
+        <w:tabs>
+          <w:tab w:val="num" w:pos="2880"/>
+        </w:tabs>
+        <w:ind w:left="2880" w:hanging="360"/>
+      </w:pPr>
+      <w:rPr>
+        <w:rFonts w:ascii="Wingdings" w:hAnsi="Wingdings" w:hint="default"/>
+        <w:sz w:val="20"/>
+      </w:rPr>
+    </w:lvl>
+    <w:lvl w:ilvl="4" w:tentative="1">
+      <w:start w:val="1"/>
+      <w:numFmt w:val="bullet"/>
+      <w:lvlText w:val=""/>
+      <w:lvlJc w:val="left"/>
+      <w:pPr>
+        <w:tabs>
+          <w:tab w:val="num" w:pos="3600"/>
+        </w:tabs>
+        <w:ind w:left="3600" w:hanging="360"/>
+      </w:pPr>
+      <w:rPr>
+        <w:rFonts w:ascii="Wingdings" w:hAnsi="Wingdings" w:hint="default"/>
+        <w:sz w:val="20"/>
+      </w:rPr>
+    </w:lvl>
+    <w:lvl w:ilvl="5" w:tentative="1">
+      <w:start w:val="1"/>
+      <w:numFmt w:val="bullet"/>
+      <w:lvlText w:val=""/>
+      <w:lvlJc w:val="left"/>
+      <w:pPr>
+        <w:tabs>
+          <w:tab w:val="num" w:pos="4320"/>
+        </w:tabs>
+        <w:ind w:left="4320" w:hanging="360"/>
+      </w:pPr>
+      <w:rPr>
+        <w:rFonts w:ascii="Wingdings" w:hAnsi="Wingdings" w:hint="default"/>
+        <w:sz w:val="20"/>
+      </w:rPr>
+    </w:lvl>
+    <w:lvl w:ilvl="6" w:tentative="1">
+      <w:start w:val="1"/>
+      <w:numFmt w:val="bullet"/>
+      <w:lvlText w:val=""/>
+      <w:lvlJc w:val="left"/>
+      <w:pPr>
+        <w:tabs>
+          <w:tab w:val="num" w:pos="5040"/>
+        </w:tabs>
+        <w:ind w:left="5040" w:hanging="360"/>
+      </w:pPr>
+      <w:rPr>
+        <w:rFonts w:ascii="Wingdings" w:hAnsi="Wingdings" w:hint="default"/>
+        <w:sz w:val="20"/>
+      </w:rPr>
+    </w:lvl>
+    <w:lvl w:ilvl="7" w:tentative="1">
+      <w:start w:val="1"/>
+      <w:numFmt w:val="bullet"/>
+      <w:lvlText w:val=""/>
+      <w:lvlJc w:val="left"/>
+      <w:pPr>
+        <w:tabs>
+          <w:tab w:val="num" w:pos="5760"/>
+        </w:tabs>
+        <w:ind w:left="5760" w:hanging="360"/>
+      </w:pPr>
+      <w:rPr>
+        <w:rFonts w:ascii="Wingdings" w:hAnsi="Wingdings" w:hint="default"/>
+        <w:sz w:val="20"/>
+      </w:rPr>
+    </w:lvl>
+    <w:lvl w:ilvl="8" w:tentative="1">
+      <w:start w:val="1"/>
+      <w:numFmt w:val="bullet"/>
+      <w:lvlText w:val=""/>
+      <w:lvlJc w:val="left"/>
+      <w:pPr>
+        <w:tabs>
+          <w:tab w:val="num" w:pos="6480"/>
+        </w:tabs>
+        <w:ind w:left="6480" w:hanging="360"/>
+      </w:pPr>
+      <w:rPr>
+        <w:rFonts w:ascii="Wingdings" w:hAnsi="Wingdings" w:hint="default"/>
+        <w:sz w:val="20"/>
+      </w:rPr>
+    </w:lvl>
+  </w:abstractNum>
+  <w:abstractNum w:abstractNumId="1" w15:restartNumberingAfterBreak="0">
+    <w:nsid w:val="44925DFB"/>
+    <w:multiLevelType w:val="multilevel"/>
+    <w:tmpl w:val="DFCE6CE6"/>
+    <w:lvl w:ilvl="0">
+      <w:start w:val="1"/>
+      <w:numFmt w:val="bullet"/>
+      <w:lvlText w:val=""/>
+      <w:lvlJc w:val="left"/>
+      <w:pPr>
+        <w:tabs>
+          <w:tab w:val="num" w:pos="720"/>
+        </w:tabs>
+        <w:ind w:left="720" w:hanging="360"/>
+      </w:pPr>
+      <w:rPr>
+        <w:rFonts w:ascii="Symbol" w:hAnsi="Symbol" w:hint="default"/>
+        <w:sz w:val="20"/>
+      </w:rPr>
+    </w:lvl>
+    <w:lvl w:ilvl="1" w:tentative="1">
+      <w:start w:val="1"/>
+      <w:numFmt w:val="bullet"/>
+      <w:lvlText w:val="o"/>
+      <w:lvlJc w:val="left"/>
+      <w:pPr>
+        <w:tabs>
+          <w:tab w:val="num" w:pos="1440"/>
+        </w:tabs>
+        <w:ind w:left="1440" w:hanging="360"/>
+      </w:pPr>
+      <w:rPr>
+        <w:rFonts w:ascii="Courier New" w:hAnsi="Courier New" w:hint="default"/>
+        <w:sz w:val="20"/>
+      </w:rPr>
+    </w:lvl>
+    <w:lvl w:ilvl="2" w:tentative="1">
+      <w:start w:val="1"/>
+      <w:numFmt w:val="bullet"/>
+      <w:lvlText w:val=""/>
+      <w:lvlJc w:val="left"/>
+      <w:pPr>
+        <w:tabs>
+          <w:tab w:val="num" w:pos="2160"/>
+        </w:tabs>
+        <w:ind w:left="2160" w:hanging="360"/>
+      </w:pPr>
+      <w:rPr>
+        <w:rFonts w:ascii="Wingdings" w:hAnsi="Wingdings" w:hint="default"/>
+        <w:sz w:val="20"/>
+      </w:rPr>
+    </w:lvl>
+    <w:lvl w:ilvl="3" w:tentative="1">
+      <w:start w:val="1"/>
+      <w:numFmt w:val="bullet"/>
+      <w:lvlText w:val=""/>
+      <w:lvlJc w:val="left"/>
+      <w:pPr>
+        <w:tabs>
+          <w:tab w:val="num" w:pos="2880"/>
+        </w:tabs>
+        <w:ind w:left="2880" w:hanging="360"/>
+      </w:pPr>
+      <w:rPr>
+        <w:rFonts w:ascii="Wingdings" w:hAnsi="Wingdings" w:hint="default"/>
+        <w:sz w:val="20"/>
+      </w:rPr>
+    </w:lvl>
+    <w:lvl w:ilvl="4" w:tentative="1">
+      <w:start w:val="1"/>
+      <w:numFmt w:val="bullet"/>
+      <w:lvlText w:val=""/>
+      <w:lvlJc w:val="left"/>
+      <w:pPr>
+        <w:tabs>
+          <w:tab w:val="num" w:pos="3600"/>
+        </w:tabs>
+        <w:ind w:left="3600" w:hanging="360"/>
+      </w:pPr>
+      <w:rPr>
+        <w:rFonts w:ascii="Wingdings" w:hAnsi="Wingdings" w:hint="default"/>
+        <w:sz w:val="20"/>
+      </w:rPr>
+    </w:lvl>
+    <w:lvl w:ilvl="5" w:tentative="1">
+      <w:start w:val="1"/>
+      <w:numFmt w:val="bullet"/>
+      <w:lvlText w:val=""/>
+      <w:lvlJc w:val="left"/>
+      <w:pPr>
+        <w:tabs>
+          <w:tab w:val="num" w:pos="4320"/>
+        </w:tabs>
+        <w:ind w:left="4320" w:hanging="360"/>
+      </w:pPr>
+      <w:rPr>
+        <w:rFonts w:ascii="Wingdings" w:hAnsi="Wingdings" w:hint="default"/>
+        <w:sz w:val="20"/>
+      </w:rPr>
+    </w:lvl>
+    <w:lvl w:ilvl="6" w:tentative="1">
+      <w:start w:val="1"/>
+      <w:numFmt w:val="bullet"/>
+      <w:lvlText w:val=""/>
+      <w:lvlJc w:val="left"/>
+      <w:pPr>
+        <w:tabs>
+          <w:tab w:val="num" w:pos="5040"/>
+        </w:tabs>
+        <w:ind w:left="5040" w:hanging="360"/>
+      </w:pPr>
+      <w:rPr>
+        <w:rFonts w:ascii="Wingdings" w:hAnsi="Wingdings" w:hint="default"/>
+        <w:sz w:val="20"/>
+      </w:rPr>
+    </w:lvl>
+    <w:lvl w:ilvl="7" w:tentative="1">
+      <w:start w:val="1"/>
+      <w:numFmt w:val="bullet"/>
+      <w:lvlText w:val=""/>
+      <w:lvlJc w:val="left"/>
+      <w:pPr>
+        <w:tabs>
+          <w:tab w:val="num" w:pos="5760"/>
+        </w:tabs>
+        <w:ind w:left="5760" w:hanging="360"/>
+      </w:pPr>
+      <w:rPr>
+        <w:rFonts w:ascii="Wingdings" w:hAnsi="Wingdings" w:hint="default"/>
+        <w:sz w:val="20"/>
+      </w:rPr>
+    </w:lvl>
+    <w:lvl w:ilvl="8" w:tentative="1">
+      <w:start w:val="1"/>
+      <w:numFmt w:val="bullet"/>
+      <w:lvlText w:val=""/>
+      <w:lvlJc w:val="left"/>
+      <w:pPr>
+        <w:tabs>
+          <w:tab w:val="num" w:pos="6480"/>
+        </w:tabs>
+        <w:ind w:left="6480" w:hanging="360"/>
+      </w:pPr>
+      <w:rPr>
+        <w:rFonts w:ascii="Wingdings" w:hAnsi="Wingdings" w:hint="default"/>
+        <w:sz w:val="20"/>
+      </w:rPr>
+    </w:lvl>
+  </w:abstractNum>
+  <w:abstractNum w:abstractNumId="2" w15:restartNumberingAfterBreak="0">
+    <w:nsid w:val="66A21465"/>
+    <w:multiLevelType w:val="hybridMultilevel"/>
+    <w:tmpl w:val="59CA06E6"/>
+    <w:lvl w:ilvl="0" w:tplc="0409000F">
+      <w:start w:val="1"/>
+      <w:numFmt w:val="decimal"/>
+      <w:lvlText w:val="%1."/>
+      <w:lvlJc w:val="left"/>
+      <w:pPr>
+        <w:ind w:left="720" w:hanging="360"/>
+      </w:pPr>
+      <w:rPr>
+        <w:rFonts w:hint="default"/>
+      </w:rPr>
+    </w:lvl>
+    <w:lvl w:ilvl="1" w:tplc="04090019" w:tentative="1">
+      <w:start w:val="1"/>
+      <w:numFmt w:val="lowerLetter"/>
+      <w:lvlText w:val="%2."/>
+      <w:lvlJc w:val="left"/>
+      <w:pPr>
+        <w:ind w:left="1440" w:hanging="360"/>
+      </w:pPr>
+    </w:lvl>
+    <w:lvl w:ilvl="2" w:tplc="0409001B" w:tentative="1">
+      <w:start w:val="1"/>
+      <w:numFmt w:val="lowerRoman"/>
+      <w:lvlText w:val="%3."/>
+      <w:lvlJc w:val="right"/>
+      <w:pPr>
+        <w:ind w:left="2160" w:hanging="180"/>
+      </w:pPr>
+    </w:lvl>
+    <w:lvl w:ilvl="3" w:tplc="0409000F" w:tentative="1">
+      <w:start w:val="1"/>
+      <w:numFmt w:val="decimal"/>
+      <w:lvlText w:val="%4."/>
+      <w:lvlJc w:val="left"/>
+      <w:pPr>
+        <w:ind w:left="2880" w:hanging="360"/>
+      </w:pPr>
+    </w:lvl>
+    <w:lvl w:ilvl="4" w:tplc="04090019" w:tentative="1">
+      <w:start w:val="1"/>
+      <w:numFmt w:val="lowerLetter"/>
+      <w:lvlText w:val="%5."/>
+      <w:lvlJc w:val="left"/>
+      <w:pPr>
+        <w:ind w:left="3600" w:hanging="360"/>
+      </w:pPr>
+    </w:lvl>
+    <w:lvl w:ilvl="5" w:tplc="0409001B" w:tentative="1">
+      <w:start w:val="1"/>
+      <w:numFmt w:val="lowerRoman"/>
+      <w:lvlText w:val="%6."/>
+      <w:lvlJc w:val="right"/>
+      <w:pPr>
+        <w:ind w:left="4320" w:hanging="180"/>
+      </w:pPr>
+    </w:lvl>
+    <w:lvl w:ilvl="6" w:tplc="0409000F" w:tentative="1">
+      <w:start w:val="1"/>
+      <w:numFmt w:val="decimal"/>
+      <w:lvlText w:val="%7."/>
+      <w:lvlJc w:val="left"/>
+      <w:pPr>
+        <w:ind w:left="5040" w:hanging="360"/>
+      </w:pPr>
+    </w:lvl>
+    <w:lvl w:ilvl="7" w:tplc="04090019" w:tentative="1">
+      <w:start w:val="1"/>
+      <w:numFmt w:val="lowerLetter"/>
+      <w:lvlText w:val="%8."/>
+      <w:lvlJc w:val="left"/>
+      <w:pPr>
+        <w:ind w:left="5760" w:hanging="360"/>
+      </w:pPr>
+    </w:lvl>
+    <w:lvl w:ilvl="8" w:tplc="0409001B" w:tentative="1">
+      <w:start w:val="1"/>
+      <w:numFmt w:val="lowerRoman"/>
+      <w:lvlText w:val="%9."/>
+      <w:lvlJc w:val="right"/>
+      <w:pPr>
+        <w:ind w:left="6480" w:hanging="180"/>
+      </w:pPr>
+    </w:lvl>
+  </w:abstractNum>
+  <w:num w:numId="1" w16cid:durableId="279340227">
+    <w:abstractNumId w:val="1"/>
+  </w:num>
+  <w:num w:numId="2" w16cid:durableId="341903121">
+    <w:abstractNumId w:val="0"/>
+  </w:num>
+  <w:num w:numId="3" w16cid:durableId="457529243">
+    <w:abstractNumId w:val="2"/>
+  </w:num>
+</w:numbering>
 </file>
 
 <file path=word/styles.xml><?xml version="1.0" encoding="utf-8"?>
@@ -893,6 +2792,50 @@
     <w:name w:val="Normal"/>
     <w:qFormat/>
   </w:style>
+  <w:style w:type="paragraph" w:styleId="Heading1">
+    <w:name w:val="heading 1"/>
+    <w:basedOn w:val="Normal"/>
+    <w:next w:val="Normal"/>
+    <w:link w:val="Heading1Char"/>
+    <w:uiPriority w:val="9"/>
+    <w:qFormat/>
+    <w:rsid w:val="00BA5D70"/>
+    <w:pPr>
+      <w:keepNext/>
+      <w:keepLines/>
+      <w:spacing w:before="240" w:after="0"/>
+      <w:outlineLvl w:val="0"/>
+    </w:pPr>
+    <w:rPr>
+      <w:rFonts w:asciiTheme="majorHAnsi" w:eastAsiaTheme="majorEastAsia" w:hAnsiTheme="majorHAnsi" w:cstheme="majorBidi"/>
+      <w:color w:val="2F5496" w:themeColor="accent1" w:themeShade="BF"/>
+      <w:sz w:val="32"/>
+      <w:szCs w:val="32"/>
+    </w:rPr>
+  </w:style>
+  <w:style w:type="paragraph" w:styleId="Heading3">
+    <w:name w:val="heading 3"/>
+    <w:basedOn w:val="Normal"/>
+    <w:next w:val="Normal"/>
+    <w:link w:val="Heading3Char"/>
+    <w:uiPriority w:val="9"/>
+    <w:semiHidden/>
+    <w:unhideWhenUsed/>
+    <w:qFormat/>
+    <w:rsid w:val="00A12455"/>
+    <w:pPr>
+      <w:keepNext/>
+      <w:keepLines/>
+      <w:spacing w:before="40" w:after="0"/>
+      <w:outlineLvl w:val="2"/>
+    </w:pPr>
+    <w:rPr>
+      <w:rFonts w:asciiTheme="majorHAnsi" w:eastAsiaTheme="majorEastAsia" w:hAnsiTheme="majorHAnsi" w:cstheme="majorBidi"/>
+      <w:color w:val="1F3763" w:themeColor="accent1" w:themeShade="7F"/>
+      <w:sz w:val="24"/>
+      <w:szCs w:val="24"/>
+    </w:rPr>
+  </w:style>
   <w:style w:type="paragraph" w:styleId="Heading4">
     <w:name w:val="heading 4"/>
     <w:basedOn w:val="Normal"/>
@@ -918,7 +2861,6 @@
   <w:style w:type="character" w:default="1" w:styleId="DefaultParagraphFont">
     <w:name w:val="Default Paragraph Font"/>
     <w:uiPriority w:val="1"/>
-    <w:semiHidden/>
     <w:unhideWhenUsed/>
   </w:style>
   <w:style w:type="table" w:default="1" w:styleId="TableNormal">
@@ -1055,6 +2997,44 @@
       <w:color w:val="605E5C"/>
       <w:shd w:val="clear" w:color="auto" w:fill="E1DFDD"/>
     </w:rPr>
+  </w:style>
+  <w:style w:type="character" w:customStyle="1" w:styleId="Heading3Char">
+    <w:name w:val="Heading 3 Char"/>
+    <w:basedOn w:val="DefaultParagraphFont"/>
+    <w:link w:val="Heading3"/>
+    <w:uiPriority w:val="9"/>
+    <w:semiHidden/>
+    <w:rsid w:val="00A12455"/>
+    <w:rPr>
+      <w:rFonts w:asciiTheme="majorHAnsi" w:eastAsiaTheme="majorEastAsia" w:hAnsiTheme="majorHAnsi" w:cstheme="majorBidi"/>
+      <w:color w:val="1F3763" w:themeColor="accent1" w:themeShade="7F"/>
+      <w:sz w:val="24"/>
+      <w:szCs w:val="24"/>
+    </w:rPr>
+  </w:style>
+  <w:style w:type="character" w:customStyle="1" w:styleId="Heading1Char">
+    <w:name w:val="Heading 1 Char"/>
+    <w:basedOn w:val="DefaultParagraphFont"/>
+    <w:link w:val="Heading1"/>
+    <w:uiPriority w:val="9"/>
+    <w:rsid w:val="00BA5D70"/>
+    <w:rPr>
+      <w:rFonts w:asciiTheme="majorHAnsi" w:eastAsiaTheme="majorEastAsia" w:hAnsiTheme="majorHAnsi" w:cstheme="majorBidi"/>
+      <w:color w:val="2F5496" w:themeColor="accent1" w:themeShade="BF"/>
+      <w:sz w:val="32"/>
+      <w:szCs w:val="32"/>
+    </w:rPr>
+  </w:style>
+  <w:style w:type="paragraph" w:styleId="ListParagraph">
+    <w:name w:val="List Paragraph"/>
+    <w:basedOn w:val="Normal"/>
+    <w:uiPriority w:val="34"/>
+    <w:qFormat/>
+    <w:rsid w:val="00BA5D70"/>
+    <w:pPr>
+      <w:ind w:left="720"/>
+      <w:contextualSpacing/>
+    </w:pPr>
   </w:style>
 </w:styles>
 </file>
@@ -1352,4 +3332,10 @@
     </a:ext>
   </a:extLst>
 </a:theme>
+</file>
+
+<file path=docMetadata/LabelInfo.xml><?xml version="1.0" encoding="utf-8"?>
+<clbl:labelList xmlns:clbl="http://schemas.microsoft.com/office/2020/mipLabelMetadata">
+  <clbl:label id="{e760c494-6550-44b4-8258-77c175d778b7}" enabled="1" method="Privileged" siteId="{76a2ae5a-9f00-4f6b-95ed-5d33d77c4d61}" contentBits="0" removed="0"/>
+</clbl:labelList>
 </file>
</xml_diff>